<commit_message>
Add backlog-health dashboard with human-in-the-loop review; update agents, eval harness, docs and presentation
- dashboard/: FastAPI backlog-health dashboard + review queue (deployed to Azure App Service F1)
- config/dor_policy.json: externalized DoR policy for quality_rules
- challenge-3-evaluate/run_local_eval.py: local eval harness
- docs/: evaluation, examples, iteration log, results, roadmap
- updated agents, deploy pipeline, tests, requirements and presentation assets
</commit_message>
<xml_diff>
--- a/presentation/AI-Agile-Delivery-Governance-Overview.docx
+++ b/presentation/AI-Agile-Delivery-Governance-Overview.docx
@@ -1174,7 +1174,20 @@
           <w:sz w:val="22"/>
           <w:szCs w:val="22"/>
         </w:rPr>
-        <w:t xml:space="preserve">The Governance Agent is measured against a hand-labelled golden set of fifteen stories, spanning ready and needs-refinement cases. Each story carries its expected classification, gate decision, and issues, so the LLM-as-judge evaluation measures real correctness — not a soft “looks good”. The mix is intentional: clean stories that must pass, and stories with specific seeded problems that the agent must catch without inventing problems that aren't there.</w:t>
+        <w:t xml:space="preserve">The system is measured three ways. Correctness — does the gate decide right? — is scored offline against a hand-labelled golden set of fifteen stories: issue-detection precision 0.91, recall 0.98, and gate accuracy 0.93 (14 of 15 decisions matching the human label). Output quality is scored by the Foundry LLM-as-judge: coherence 4.7 out of 5, intent resolution 4.9, and fluency 4.0. Safety is a clean sweep across every Foundry safety evaluator — no violent, self-harm, sexual or hateful content, and the protected-material, code-vulnerability and indirect-attack checks all pass.</w:t>
+      </w:r>
+    </w:p>
+    <w:p>
+      <w:pPr>
+        <w:spacing w:after="140" w:line="288"/>
+      </w:pPr>
+      <w:r>
+        <w:rPr>
+          <w:color w:val="1E293B"/>
+          <w:sz w:val="22"/>
+          <w:szCs w:val="22"/>
+        </w:rPr>
+        <w:t xml:space="preserve">A note from running the Foundry evaluation: the portal does not execute custom Python tools, so an early run of the Governance Agent stopped at its tool call without producing a verdict. The agent was therefore made self-sufficient — it evaluates the story text directly and treats the tool as an optional accelerator — so it is fully evaluable in the portal while the tool path remains intact for production. Full detail is in the project's EVALUATION document.</w:t>
       </w:r>
     </w:p>
     <w:p>
@@ -1318,6 +1331,103 @@
           <w:szCs w:val="22"/>
         </w:rPr>
         <w:t xml:space="preserve">. You don't trust its output because it sounds confident; you trust it because it is measured.</w:t>
+      </w:r>
+    </w:p>
+    <w:p>
+      <w:pPr>
+        <w:pStyle w:val="Heading1"/>
+        <w:spacing w:after="160" w:before="320"/>
+      </w:pPr>
+      <w:r>
+        <w:t xml:space="preserve">Human-in-the-loop and the backlog-health dashboard</w:t>
+      </w:r>
+    </w:p>
+    <w:p>
+      <w:pPr>
+        <w:spacing w:after="140" w:line="288"/>
+      </w:pPr>
+      <w:r>
+        <w:rPr>
+          <w:color w:val="1E293B"/>
+          <w:sz w:val="22"/>
+          <w:szCs w:val="22"/>
+        </w:rPr>
+        <w:t xml:space="preserve">The gate decision is three-way — pass, review, or reject. Stories the gate cannot confidently auto-decide (borderline scores, set by a configurable per-team review band, or stories that trip a hard blocker such as an unstated dependency) are routed to a person rather than guessed. The reviewer's accept-or-send-back decision is recorded and appended as a new ground-truth label, so the gate keeps improving on exactly the cases it found hard. That is the feedback loop closing.</w:t>
+      </w:r>
+    </w:p>
+    <w:p>
+      <w:pPr>
+        <w:spacing w:after="140" w:line="288"/>
+      </w:pPr>
+      <w:r>
+        <w:rPr>
+          <w:color w:val="1E293B"/>
+          <w:sz w:val="22"/>
+          <w:szCs w:val="22"/>
+        </w:rPr>
+        <w:t xml:space="preserve">A web dashboard turns the per-story gate into a backlog-health instrument. Because every verdict is structured, the dashboard aggregates them into health signals — the gate pass-rate, recurring INVEST failures by dimension, the most common issues, and the human review queue with story ageing — over data the system already produces.</w:t>
+      </w:r>
+    </w:p>
+    <w:p>
+      <w:pPr>
+        <w:spacing w:after="80" w:before="80"/>
+        <w:jc w:val="center"/>
+      </w:pPr>
+      <w:r>
+        <w:drawing>
+          <wp:inline distT="0" distB="0" distL="0" distR="0">
+            <wp:extent cx="5715000" cy="4467225"/>
+            <wp:effectExtent t="0" r="0" b="0" l="0"/>
+            <wp:docPr id="1" name="" descr="" title=""/>
+            <wp:cNvGraphicFramePr>
+              <a:graphicFrameLocks xmlns:a="http://schemas.openxmlformats.org/drawingml/2006/main" noChangeAspect="1"/>
+            </wp:cNvGraphicFramePr>
+            <a:graphic xmlns:a="http://schemas.openxmlformats.org/drawingml/2006/main">
+              <a:graphicData uri="http://schemas.openxmlformats.org/drawingml/2006/picture">
+                <pic:pic xmlns:pic="http://schemas.openxmlformats.org/drawingml/2006/picture">
+                  <pic:nvPicPr>
+                    <pic:cNvPr id="0" name="" descr=""/>
+                    <pic:cNvPicPr>
+                      <a:picLocks noChangeAspect="1" noChangeArrowheads="1"/>
+                    </pic:cNvPicPr>
+                  </pic:nvPicPr>
+                  <pic:blipFill>
+                    <a:blip r:embed="rId7" cstate="none"/>
+                    <a:srcRect/>
+                    <a:stretch>
+                      <a:fillRect/>
+                    </a:stretch>
+                  </pic:blipFill>
+                  <pic:spPr bwMode="auto">
+                    <a:xfrm>
+                      <a:off x="0" y="0"/>
+                      <a:ext cx="5715000" cy="4467225"/>
+                    </a:xfrm>
+                    <a:prstGeom prst="rect">
+                      <a:avLst/>
+                    </a:prstGeom>
+                  </pic:spPr>
+                </pic:pic>
+              </a:graphicData>
+            </a:graphic>
+          </wp:inline>
+        </w:drawing>
+      </w:r>
+    </w:p>
+    <w:p>
+      <w:pPr>
+        <w:spacing w:after="160"/>
+        <w:jc w:val="center"/>
+      </w:pPr>
+      <w:r>
+        <w:rPr>
+          <w:i/>
+          <w:iCs/>
+          <w:color w:val="475569"/>
+          <w:sz w:val="18"/>
+          <w:szCs w:val="18"/>
+        </w:rPr>
+        <w:t xml:space="preserve">The backlog-health dashboard with the human review queue.</w:t>
       </w:r>
     </w:p>
     <w:p>

</xml_diff>